<commit_message>
CV updated, Side projects section updated
</commit_message>
<xml_diff>
--- a/static/Gabor_Koos_resume.docx
+++ b/static/Gabor_Koos_resume.docx
@@ -21,32 +21,57 @@
         </w:rPr>
         <w:t>Gabor Koos</w:t>
       </w:r>
+    </w:p>
+    <w:p>
+      <w:pPr>
+        <w:pStyle w:val="Normal"/>
+        <w:shd w:val="clear" w:fill="FFFFFF"/>
+        <w:spacing w:lineRule="atLeast" w:line="384" w:before="180" w:after="180"/>
+        <w:jc w:val="center"/>
+        <w:rPr/>
+      </w:pPr>
       <w:r>
         <w:rPr>
           <w:rStyle w:val="DefaultParagraphFont"/>
           <w:rFonts w:eastAsia="Times New Roman"/>
           <w:color w:val="111111"/>
-          <w:lang w:eastAsia="en-GB"/>
-        </w:rPr>
-        <w:br/>
-        <w:t xml:space="preserve">London, </w:t>
+          <w:sz w:val="22"/>
+          <w:szCs w:val="22"/>
+          <w:lang w:eastAsia="en-GB"/>
+        </w:rPr>
+        <w:t xml:space="preserve">Software Engineer • </w:t>
       </w:r>
       <w:r>
         <w:rPr>
           <w:rStyle w:val="DefaultParagraphFont"/>
           <w:rFonts w:eastAsia="Times New Roman"/>
           <w:color w:val="111111"/>
-          <w:lang w:eastAsia="en-GB"/>
-        </w:rPr>
-        <w:t>United Kingdom</w:t>
+          <w:sz w:val="22"/>
+          <w:szCs w:val="22"/>
+          <w:lang w:eastAsia="en-GB"/>
+        </w:rPr>
+        <w:t>Technical Writer</w:t>
       </w:r>
       <w:r>
         <w:rPr>
           <w:rStyle w:val="DefaultParagraphFont"/>
           <w:rFonts w:eastAsia="Times New Roman"/>
           <w:color w:val="111111"/>
-          <w:lang w:eastAsia="en-GB"/>
-        </w:rPr>
+          <w:sz w:val="22"/>
+          <w:szCs w:val="22"/>
+          <w:lang w:eastAsia="en-GB"/>
+        </w:rPr>
+        <w:t xml:space="preserve"> • OSS Maintainer </w:t>
+      </w:r>
+      <w:r>
+        <w:rPr>
+          <w:rStyle w:val="DefaultParagraphFont"/>
+          <w:rFonts w:eastAsia="Times New Roman"/>
+          <w:color w:val="111111"/>
+          <w:lang w:eastAsia="en-GB"/>
+        </w:rPr>
+        <w:br/>
+        <w:t>London, United Kingdom</w:t>
         <w:br/>
       </w:r>
       <w:hyperlink r:id="rId2" w:tgtFrame="_top">
@@ -77,16 +102,7 @@
             <w:color w:val="111111"/>
             <w:lang w:eastAsia="en-GB"/>
           </w:rPr>
-          <w:t>https://</w:t>
-        </w:r>
-        <w:r>
-          <w:rPr>
-            <w:rStyle w:val="Hyperlink"/>
-            <w:rFonts w:eastAsia="Times New Roman"/>
-            <w:color w:val="111111"/>
-            <w:lang w:eastAsia="en-GB"/>
-          </w:rPr>
-          <w:t>www.linkedin.com/in/gabor-koos/</w:t>
+          <w:t>https://www.linkedin.com/in/gabor-koos/</w:t>
         </w:r>
       </w:hyperlink>
     </w:p>
@@ -106,16 +122,7 @@
             <w:color w:val="111111"/>
             <w:lang w:eastAsia="en-GB"/>
           </w:rPr>
-          <w:t>https://</w:t>
-        </w:r>
-        <w:r>
-          <w:rPr>
-            <w:rStyle w:val="Hyperlink"/>
-            <w:rFonts w:eastAsia="Times New Roman"/>
-            <w:color w:val="111111"/>
-            <w:lang w:eastAsia="en-GB"/>
-          </w:rPr>
-          <w:t>gaborkoos.com</w:t>
+          <w:t>https://gaborkoos.com</w:t>
         </w:r>
       </w:hyperlink>
     </w:p>
@@ -4220,6 +4227,257 @@
           <w:lang w:eastAsia="en-GB"/>
         </w:rPr>
         <w:t>BGT in-shop betting terminals Horses and Greyhounds Predictor, bet prompts</w:t>
+      </w:r>
+    </w:p>
+    <w:p>
+      <w:pPr>
+        <w:pStyle w:val="Normal"/>
+        <w:shd w:val="clear" w:fill="FFFFFF"/>
+        <w:spacing w:lineRule="atLeast" w:line="384" w:before="0" w:after="180"/>
+        <w:rPr>
+          <w:rFonts w:eastAsia="Times New Roman"/>
+          <w:b/>
+          <w:bCs/>
+          <w:color w:val="FF8150"/>
+          <w:sz w:val="28"/>
+          <w:szCs w:val="28"/>
+          <w:lang w:eastAsia="en-GB"/>
+        </w:rPr>
+      </w:pPr>
+      <w:r>
+        <w:rPr/>
+      </w:r>
+    </w:p>
+    <w:p>
+      <w:pPr>
+        <w:pStyle w:val="Normal"/>
+        <w:shd w:val="clear" w:fill="FFFFFF"/>
+        <w:spacing w:lineRule="atLeast" w:line="384" w:before="0" w:after="180"/>
+        <w:rPr>
+          <w:rFonts w:eastAsia="Times New Roman"/>
+          <w:b/>
+          <w:bCs/>
+          <w:color w:val="FF8150"/>
+          <w:sz w:val="28"/>
+          <w:szCs w:val="28"/>
+          <w:lang w:eastAsia="en-GB"/>
+        </w:rPr>
+      </w:pPr>
+      <w:r>
+        <w:rPr>
+          <w:rFonts w:eastAsia="Times New Roman"/>
+          <w:b/>
+          <w:bCs/>
+          <w:color w:val="FF8150"/>
+          <w:sz w:val="28"/>
+          <w:szCs w:val="28"/>
+          <w:lang w:eastAsia="en-GB"/>
+        </w:rPr>
+        <w:t xml:space="preserve">Publications &amp; Open Source </w:t>
+      </w:r>
+    </w:p>
+    <w:p>
+      <w:pPr>
+        <w:pStyle w:val="Normal"/>
+        <w:numPr>
+          <w:ilvl w:val="0"/>
+          <w:numId w:val="3"/>
+        </w:numPr>
+        <w:shd w:val="clear" w:fill="FFFFFF"/>
+        <w:tabs>
+          <w:tab w:val="clear" w:pos="720"/>
+        </w:tabs>
+        <w:spacing w:lineRule="atLeast" w:line="384" w:before="0" w:after="0"/>
+        <w:ind w:hanging="624" w:start="737" w:end="0"/>
+        <w:rPr>
+          <w:rFonts w:eastAsia="Times New Roman" w:cs="Times New Roman"/>
+          <w:color w:val="111111"/>
+          <w:sz w:val="24"/>
+          <w:szCs w:val="24"/>
+          <w:lang w:eastAsia="en-GB"/>
+        </w:rPr>
+      </w:pPr>
+      <w:r>
+        <w:rPr>
+          <w:rStyle w:val="Hyperlink"/>
+          <w:rFonts w:eastAsia="Times New Roman" w:cs="Times New Roman"/>
+          <w:color w:val="111111"/>
+          <w:sz w:val="24"/>
+          <w:szCs w:val="24"/>
+          <w:u w:val="none"/>
+          <w:lang w:eastAsia="en-GB"/>
+        </w:rPr>
+        <w:t xml:space="preserve">author of </w:t>
+      </w:r>
+      <w:hyperlink r:id="rId14">
+        <w:r>
+          <w:rPr>
+            <w:rStyle w:val="Hyperlink"/>
+            <w:rFonts w:eastAsia="Times New Roman" w:cs="Times New Roman"/>
+            <w:color w:val="111111"/>
+            <w:sz w:val="24"/>
+            <w:szCs w:val="24"/>
+            <w:u w:val="none"/>
+            <w:lang w:eastAsia="en-GB"/>
+          </w:rPr>
+          <w:t>I</w:t>
+        </w:r>
+        <w:r>
+          <w:rPr>
+            <w:rStyle w:val="Hyperlink"/>
+            <w:rFonts w:eastAsia="Times New Roman" w:cs="Times New Roman"/>
+            <w:color w:val="111111"/>
+            <w:sz w:val="24"/>
+            <w:szCs w:val="24"/>
+            <w:u w:val="none"/>
+            <w:lang w:eastAsia="en-GB"/>
+          </w:rPr>
+          <w:t xml:space="preserve">mport </w:t>
+        </w:r>
+        <w:r>
+          <w:rPr>
+            <w:rStyle w:val="Hyperlink"/>
+            <w:rFonts w:eastAsia="Times New Roman" w:cs="Times New Roman"/>
+            <w:color w:val="111111"/>
+            <w:sz w:val="24"/>
+            <w:szCs w:val="24"/>
+            <w:u w:val="none"/>
+            <w:lang w:eastAsia="en-GB"/>
+          </w:rPr>
+          <w:t>C</w:t>
+        </w:r>
+        <w:r>
+          <w:rPr>
+            <w:rStyle w:val="Hyperlink"/>
+            <w:rFonts w:eastAsia="Times New Roman" w:cs="Times New Roman"/>
+            <w:color w:val="111111"/>
+            <w:sz w:val="24"/>
+            <w:szCs w:val="24"/>
+            <w:u w:val="none"/>
+            <w:lang w:eastAsia="en-GB"/>
+          </w:rPr>
+          <w:t>haos</w:t>
+        </w:r>
+      </w:hyperlink>
+      <w:r>
+        <w:rPr>
+          <w:rStyle w:val="Hyperlink"/>
+          <w:rFonts w:eastAsia="Times New Roman" w:cs="Times New Roman"/>
+          <w:color w:val="111111"/>
+          <w:sz w:val="24"/>
+          <w:szCs w:val="24"/>
+          <w:u w:val="none"/>
+          <w:lang w:eastAsia="en-GB"/>
+        </w:rPr>
+        <w:t xml:space="preserve"> - blog on full stack development, Golang internals, and API reliability </w:t>
+      </w:r>
+    </w:p>
+    <w:p>
+      <w:pPr>
+        <w:pStyle w:val="Normal"/>
+        <w:numPr>
+          <w:ilvl w:val="0"/>
+          <w:numId w:val="3"/>
+        </w:numPr>
+        <w:shd w:val="clear" w:fill="FFFFFF"/>
+        <w:tabs>
+          <w:tab w:val="clear" w:pos="720"/>
+        </w:tabs>
+        <w:spacing w:lineRule="atLeast" w:line="384" w:before="0" w:after="0"/>
+        <w:ind w:hanging="624" w:start="737" w:end="0"/>
+        <w:rPr>
+          <w:rFonts w:eastAsia="Times New Roman" w:cs="Times New Roman"/>
+          <w:color w:val="111111"/>
+          <w:sz w:val="24"/>
+          <w:szCs w:val="24"/>
+          <w:lang w:eastAsia="en-GB"/>
+        </w:rPr>
+      </w:pPr>
+      <w:r>
+        <w:rPr>
+          <w:rStyle w:val="Hyperlink"/>
+          <w:rFonts w:eastAsia="Times New Roman" w:cs="Times New Roman"/>
+          <w:color w:val="111111"/>
+          <w:sz w:val="24"/>
+          <w:szCs w:val="24"/>
+          <w:u w:val="none"/>
+          <w:lang w:eastAsia="en-GB"/>
+        </w:rPr>
+        <w:t xml:space="preserve">freeCodeCamp </w:t>
+      </w:r>
+      <w:hyperlink r:id="rId15">
+        <w:r>
+          <w:rPr>
+            <w:rStyle w:val="Hyperlink"/>
+            <w:rFonts w:eastAsia="Times New Roman" w:cs="Times New Roman"/>
+            <w:color w:val="111111"/>
+            <w:sz w:val="24"/>
+            <w:szCs w:val="24"/>
+            <w:u w:val="none"/>
+            <w:lang w:eastAsia="en-GB"/>
+          </w:rPr>
+          <w:t>contributor</w:t>
+        </w:r>
+      </w:hyperlink>
+    </w:p>
+    <w:p>
+      <w:pPr>
+        <w:pStyle w:val="Normal"/>
+        <w:numPr>
+          <w:ilvl w:val="0"/>
+          <w:numId w:val="3"/>
+        </w:numPr>
+        <w:shd w:val="clear" w:fill="FFFFFF"/>
+        <w:tabs>
+          <w:tab w:val="clear" w:pos="720"/>
+        </w:tabs>
+        <w:spacing w:lineRule="atLeast" w:line="384" w:before="0" w:after="0"/>
+        <w:ind w:hanging="624" w:start="737" w:end="0"/>
+        <w:rPr>
+          <w:rFonts w:eastAsia="Times New Roman" w:cs="Times New Roman"/>
+          <w:color w:val="111111"/>
+          <w:sz w:val="24"/>
+          <w:szCs w:val="24"/>
+          <w:lang w:eastAsia="en-GB"/>
+        </w:rPr>
+      </w:pPr>
+      <w:r>
+        <w:rPr>
+          <w:rStyle w:val="Hyperlink"/>
+          <w:rFonts w:eastAsia="Times New Roman" w:cs="Times New Roman"/>
+          <w:color w:val="111111"/>
+          <w:sz w:val="24"/>
+          <w:szCs w:val="24"/>
+          <w:u w:val="none"/>
+          <w:lang w:eastAsia="en-GB"/>
+        </w:rPr>
+        <w:t xml:space="preserve">creator of </w:t>
+      </w:r>
+      <w:hyperlink r:id="rId16">
+        <w:r>
+          <w:rPr>
+            <w:rStyle w:val="Hyperlink"/>
+            <w:rFonts w:eastAsia="Times New Roman" w:cs="Times New Roman"/>
+            <w:color w:val="111111"/>
+            <w:sz w:val="24"/>
+            <w:szCs w:val="24"/>
+            <w:u w:val="none"/>
+            <w:lang w:eastAsia="en-GB"/>
+          </w:rPr>
+          <w:t>fetch-kit</w:t>
+        </w:r>
+      </w:hyperlink>
+      <w:r>
+        <w:rPr>
+          <w:rStyle w:val="Hyperlink"/>
+          <w:rFonts w:eastAsia="Times New Roman" w:cs="Times New Roman"/>
+          <w:color w:val="111111"/>
+          <w:sz w:val="24"/>
+          <w:szCs w:val="24"/>
+          <w:u w:val="none"/>
+          <w:lang w:eastAsia="en-GB"/>
+        </w:rPr>
+        <w:t xml:space="preserve"> - an ecosystem of JavaScript/TypeScript libraries for safe and testable data fetching </w:t>
       </w:r>
     </w:p>
     <w:p>
@@ -4986,7 +5244,7 @@
       <w:widowControl/>
       <w:shd w:val="clear" w:fill="auto"/>
       <w:suppressAutoHyphens w:val="true"/>
-      <w:overflowPunct w:val="false"/>
+      <w:overflowPunct w:val="true"/>
       <w:bidi w:val="0"/>
       <w:snapToGrid w:val="true"/>
       <w:spacing w:lineRule="auto" w:line="252" w:before="0" w:after="160"/>
@@ -5497,6 +5755,13 @@
       <w:rFonts w:ascii="Wingdings" w:hAnsi="Wingdings"/>
     </w:rPr>
   </w:style>
+  <w:style w:type="character" w:styleId="FollowedHyperlink">
+    <w:name w:val="FollowedHyperlink"/>
+    <w:rPr>
+      <w:color w:val="800000"/>
+      <w:u w:val="single"/>
+    </w:rPr>
+  </w:style>
   <w:style w:type="paragraph" w:styleId="Heading">
     <w:name w:val="Heading"/>
     <w:basedOn w:val="Normal"/>
@@ -5573,7 +5838,7 @@
       <w:widowControl w:val="false"/>
       <w:shd w:val="clear" w:fill="auto"/>
       <w:suppressAutoHyphens w:val="true"/>
-      <w:overflowPunct w:val="false"/>
+      <w:overflowPunct w:val="true"/>
       <w:bidi w:val="0"/>
       <w:snapToGrid w:val="true"/>
       <w:spacing w:lineRule="auto" w:line="240" w:before="0" w:after="0"/>

</xml_diff>